<commit_message>
first since went private
</commit_message>
<xml_diff>
--- a/Python_Data_Wrangling_in_Google_Colab_41.docx
+++ b/Python_Data_Wrangling_in_Google_Colab_41.docx
@@ -16,21 +16,21 @@
           <w:sz w:val="24"/>
           <w:szCs w:val="52"/>
         </w:rPr>
-        <w:t>Data Wrangling with</w:t>
+        <w:t xml:space="preserve">Google </w:t>
       </w:r>
       <w:r>
         <w:rPr>
           <w:sz w:val="24"/>
           <w:szCs w:val="52"/>
         </w:rPr>
-        <w:t xml:space="preserve"> </w:t>
+        <w:t xml:space="preserve">Research </w:t>
       </w:r>
       <w:r>
         <w:rPr>
           <w:sz w:val="24"/>
           <w:szCs w:val="52"/>
         </w:rPr>
-        <w:t>Google Colaboratory</w:t>
+        <w:t>Colaboratory</w:t>
       </w:r>
     </w:p>
     <w:p>
@@ -43,6 +43,115 @@
     </w:p>
     <w:p>
       <w:r>
+        <w:t>Google Colaboratory i</w:t>
+      </w:r>
+      <w:r>
+        <w:t xml:space="preserve">s a free, cloud-based platform </w:t>
+      </w:r>
+      <w:r>
+        <w:t>hosted</w:t>
+      </w:r>
+      <w:r>
+        <w:t xml:space="preserve"> by Google Research that allows users to </w:t>
+      </w:r>
+      <w:r>
+        <w:t xml:space="preserve">read, </w:t>
+      </w:r>
+      <w:r>
+        <w:t>write</w:t>
+      </w:r>
+      <w:r>
+        <w:t>,</w:t>
+      </w:r>
+      <w:r>
+        <w:t xml:space="preserve"> and execute Python code </w:t>
+      </w:r>
+      <w:r>
+        <w:t>using</w:t>
+      </w:r>
+      <w:r>
+        <w:t xml:space="preserve"> a web browser</w:t>
+      </w:r>
+      <w:r>
+        <w:t xml:space="preserve"> </w:t>
+      </w:r>
+      <w:r>
+        <w:t xml:space="preserve">to view Colab Notebooks. </w:t>
+      </w:r>
+      <w:r>
+        <w:t>The</w:t>
+      </w:r>
+      <w:r>
+        <w:t xml:space="preserve"> Notebook</w:t>
+      </w:r>
+      <w:r>
+        <w:t>s</w:t>
+      </w:r>
+      <w:r>
+        <w:t xml:space="preserve"> intersperse code cells</w:t>
+      </w:r>
+      <w:r>
+        <w:t xml:space="preserve"> with text cells</w:t>
+      </w:r>
+      <w:r>
+        <w:t xml:space="preserve"> to </w:t>
+      </w:r>
+      <w:r>
+        <w:t xml:space="preserve">provide an interactive </w:t>
+      </w:r>
+      <w:r>
+        <w:t xml:space="preserve">environment for </w:t>
+      </w:r>
+      <w:r>
+        <w:t>reading about, writing, and executing Python code</w:t>
+      </w:r>
+      <w:r>
+        <w:t>.</w:t>
+      </w:r>
+      <w:r>
+        <w:t xml:space="preserve"> </w:t>
+      </w:r>
+      <w:r>
+        <w:t xml:space="preserve">This </w:t>
+      </w:r>
+      <w:r>
+        <w:t xml:space="preserve">is an attractive opportunity for </w:t>
+      </w:r>
+      <w:r>
+        <w:t>a medical director who wants to learn how to wrangle data</w:t>
+      </w:r>
+      <w:r>
+        <w:t xml:space="preserve"> (p</w:t>
+      </w:r>
+      <w:r>
+        <w:t>ars</w:t>
+      </w:r>
+      <w:r>
+        <w:t>e</w:t>
+      </w:r>
+      <w:r>
+        <w:t xml:space="preserve"> text into usable </w:t>
+      </w:r>
+      <w:r>
+        <w:t>data).</w:t>
+      </w:r>
+    </w:p>
+    <w:p>
+      <w:r>
+        <w:t>A previous (2015) article is re</w:t>
+      </w:r>
+      <w:r>
+        <w:t>visited to provide updated information</w:t>
+      </w:r>
+      <w:r>
+        <w:t xml:space="preserve"> about Python and </w:t>
+      </w:r>
+      <w:r>
+        <w:t xml:space="preserve"> </w:t>
+      </w:r>
+    </w:p>
+    <w:p>
+      <w:r>
         <w:t xml:space="preserve">Parsing text into a usable format (data wrangling) is a frequent need for the medical director who needs to </w:t>
       </w:r>
       <w:r>
@@ -588,10 +697,7 @@
         <w:t xml:space="preserve"> </w:t>
       </w:r>
       <w:r>
-        <w:t>as a beginner's guide</w:t>
-      </w:r>
-      <w:r>
-        <w:t xml:space="preserve">  to the language.</w:t>
+        <w:t>as a beginner's guide  to the language.</w:t>
       </w:r>
       <w:r>
         <w:t xml:space="preserve"> </w:t>
@@ -676,6 +782,7 @@
         <w:pStyle w:val="Heading1"/>
       </w:pPr>
       <w:r>
+        <w:lastRenderedPageBreak/>
         <w:t>Methods</w:t>
       </w:r>
     </w:p>
@@ -783,7 +890,6 @@
         <w:rPr>
           <w:u w:val="single"/>
         </w:rPr>
-        <w:lastRenderedPageBreak/>
         <w:t>https://github.com/dowes48/LabReports</w:t>
       </w:r>
       <w:r>
@@ -5136,6 +5242,7 @@
                 <w:sz w:val="18"/>
                 <w:szCs w:val="18"/>
               </w:rPr>
+              <w:lastRenderedPageBreak/>
               <w:t>34321053</w:t>
             </w:r>
           </w:p>
@@ -16430,15 +16537,19 @@
 </file>
 
 <file path=customXml/item1.xml><?xml version="1.0" encoding="utf-8"?>
-<?mso-contentType ?>
-<FormTemplates xmlns="http://schemas.microsoft.com/sharepoint/v3/contenttype/forms">
-  <Display>DocumentLibraryForm</Display>
-  <Edit>DocumentLibraryForm</Edit>
-  <New>DocumentLibraryForm</New>
-</FormTemplates>
+<p:properties xmlns:p="http://schemas.microsoft.com/office/2006/metadata/properties" xmlns:xsi="http://www.w3.org/2001/XMLSchema-instance" xmlns:pc="http://schemas.microsoft.com/office/infopath/2007/PartnerControls">
+  <documentManagement>
+    <_ip_UnifiedCompliancePolicyUIAction xmlns="http://schemas.microsoft.com/sharepoint/v3" xsi:nil="true"/>
+    <_ip_UnifiedCompliancePolicyProperties xmlns="http://schemas.microsoft.com/sharepoint/v3" xsi:nil="true"/>
+  </documentManagement>
+</p:properties>
 </file>
 
 <file path=customXml/item2.xml><?xml version="1.0" encoding="utf-8"?>
+<b:Sources xmlns:b="http://schemas.openxmlformats.org/officeDocument/2006/bibliography" xmlns="http://schemas.openxmlformats.org/officeDocument/2006/bibliography" SelectedStyle="\APASixthEditionOfficeOnline.xsl" StyleName="APA" Version="6"/>
+</file>
+
+<file path=customXml/item3.xml><?xml version="1.0" encoding="utf-8"?>
 <ct:contentTypeSchema xmlns:ct="http://schemas.microsoft.com/office/2006/metadata/contentType" xmlns:ma="http://schemas.microsoft.com/office/2006/metadata/properties/metaAttributes" ct:_="" ma:_="" ma:contentTypeName="Document" ma:contentTypeID="0x010100DEEA25CC0A0AC24199CDC46C25B8B0BC" ma:contentTypeVersion="10" ma:contentTypeDescription="Create a new document." ma:contentTypeScope="" ma:versionID="e3b47856d4cf355c0dacb39e1084d14f">
   <xsd:schema xmlns:xsd="http://www.w3.org/2001/XMLSchema" xmlns:xs="http://www.w3.org/2001/XMLSchema" xmlns:p="http://schemas.microsoft.com/office/2006/metadata/properties" xmlns:ns1="http://schemas.microsoft.com/sharepoint/v3" xmlns:ns2="6dc4bcd6-49db-4c07-9060-8acfc67cef9f" xmlns:ns3="fb0879af-3eba-417a-a55a-ffe6dcd6ca77" targetNamespace="http://schemas.microsoft.com/office/2006/metadata/properties" ma:root="true" ma:fieldsID="a845a615265fdb1f7b12cc65ac20ecbd" ns1:_="" ns2:_="" ns3:_="">
     <xsd:import namespace="http://schemas.microsoft.com/sharepoint/v3"/>
@@ -16646,28 +16757,34 @@
 </ct:contentTypeSchema>
 </file>
 
-<file path=customXml/item3.xml><?xml version="1.0" encoding="utf-8"?>
-<b:Sources xmlns:b="http://schemas.openxmlformats.org/officeDocument/2006/bibliography" xmlns="http://schemas.openxmlformats.org/officeDocument/2006/bibliography" SelectedStyle="\APASixthEditionOfficeOnline.xsl" StyleName="APA" Version="6"/>
-</file>
-
 <file path=customXml/item4.xml><?xml version="1.0" encoding="utf-8"?>
-<p:properties xmlns:p="http://schemas.microsoft.com/office/2006/metadata/properties" xmlns:xsi="http://www.w3.org/2001/XMLSchema-instance" xmlns:pc="http://schemas.microsoft.com/office/infopath/2007/PartnerControls">
-  <documentManagement>
-    <_ip_UnifiedCompliancePolicyUIAction xmlns="http://schemas.microsoft.com/sharepoint/v3" xsi:nil="true"/>
-    <_ip_UnifiedCompliancePolicyProperties xmlns="http://schemas.microsoft.com/sharepoint/v3" xsi:nil="true"/>
-  </documentManagement>
-</p:properties>
+<?mso-contentType ?>
+<FormTemplates xmlns="http://schemas.microsoft.com/sharepoint/v3/contenttype/forms">
+  <Display>DocumentLibraryForm</Display>
+  <Edit>DocumentLibraryForm</Edit>
+  <New>DocumentLibraryForm</New>
+</FormTemplates>
 </file>
 
 <file path=customXml/itemProps1.xml><?xml version="1.0" encoding="utf-8"?>
-<ds:datastoreItem xmlns:ds="http://schemas.openxmlformats.org/officeDocument/2006/customXml" ds:itemID="{3D40F5E8-4448-4982-82F4-146B74EB9EB7}">
+<ds:datastoreItem xmlns:ds="http://schemas.openxmlformats.org/officeDocument/2006/customXml" ds:itemID="{BA075BD4-F53C-4E01-9EDE-4652C8A1FE4B}">
   <ds:schemaRefs>
-    <ds:schemaRef ds:uri="http://schemas.microsoft.com/sharepoint/v3/contenttype/forms"/>
+    <ds:schemaRef ds:uri="http://schemas.microsoft.com/office/2006/metadata/properties"/>
+    <ds:schemaRef ds:uri="http://schemas.microsoft.com/office/infopath/2007/PartnerControls"/>
+    <ds:schemaRef ds:uri="http://schemas.microsoft.com/sharepoint/v3"/>
   </ds:schemaRefs>
 </ds:datastoreItem>
 </file>
 
 <file path=customXml/itemProps2.xml><?xml version="1.0" encoding="utf-8"?>
+<ds:datastoreItem xmlns:ds="http://schemas.openxmlformats.org/officeDocument/2006/customXml" ds:itemID="{F6AF00D4-2EAE-41EB-B167-AD28D8029330}">
+  <ds:schemaRefs>
+    <ds:schemaRef ds:uri="http://schemas.openxmlformats.org/officeDocument/2006/bibliography"/>
+  </ds:schemaRefs>
+</ds:datastoreItem>
+</file>
+
+<file path=customXml/itemProps3.xml><?xml version="1.0" encoding="utf-8"?>
 <ds:datastoreItem xmlns:ds="http://schemas.openxmlformats.org/officeDocument/2006/customXml" ds:itemID="{D7D55E06-64DA-42F3-AD6E-D3DC24069E4B}">
   <ds:schemaRefs>
     <ds:schemaRef ds:uri="http://schemas.microsoft.com/office/2006/metadata/contentType"/>
@@ -16687,20 +16804,10 @@
 </ds:datastoreItem>
 </file>
 
-<file path=customXml/itemProps3.xml><?xml version="1.0" encoding="utf-8"?>
-<ds:datastoreItem xmlns:ds="http://schemas.openxmlformats.org/officeDocument/2006/customXml" ds:itemID="{F6AF00D4-2EAE-41EB-B167-AD28D8029330}">
+<file path=customXml/itemProps4.xml><?xml version="1.0" encoding="utf-8"?>
+<ds:datastoreItem xmlns:ds="http://schemas.openxmlformats.org/officeDocument/2006/customXml" ds:itemID="{3D40F5E8-4448-4982-82F4-146B74EB9EB7}">
   <ds:schemaRefs>
-    <ds:schemaRef ds:uri="http://schemas.openxmlformats.org/officeDocument/2006/bibliography"/>
-  </ds:schemaRefs>
-</ds:datastoreItem>
-</file>
-
-<file path=customXml/itemProps4.xml><?xml version="1.0" encoding="utf-8"?>
-<ds:datastoreItem xmlns:ds="http://schemas.openxmlformats.org/officeDocument/2006/customXml" ds:itemID="{BA075BD4-F53C-4E01-9EDE-4652C8A1FE4B}">
-  <ds:schemaRefs>
-    <ds:schemaRef ds:uri="http://schemas.microsoft.com/office/2006/metadata/properties"/>
-    <ds:schemaRef ds:uri="http://schemas.microsoft.com/office/infopath/2007/PartnerControls"/>
-    <ds:schemaRef ds:uri="http://schemas.microsoft.com/sharepoint/v3"/>
+    <ds:schemaRef ds:uri="http://schemas.microsoft.com/sharepoint/v3/contenttype/forms"/>
   </ds:schemaRefs>
 </ds:datastoreItem>
 </file>
</xml_diff>